<commit_message>
feat: DOCX export redesign + annotator improvements
doc_renderer.py:
- Full DOCX rebuild using docxtpl with step screenshots (annotated if available)
- Section ordering via display_order, step sub_steps list rendering
- Image resizing to fit column width

annotator.py:
- Improved callout rendering (OCR green, gemini amber, repositioned blue)
- Pillow-based annotation with coordinate scaling from natural image dims

create_placeholder_template.py:
- Placeholder template generator updated to match new Jinja2 template schema

Co-Authored-By: Claude Sonnet 4.6 <noreply@anthropic.com>
</commit_message>
<xml_diff>
--- a/sop-platform/data/templates/sop_template.docx
+++ b/sop-platform/data/templates/sop_template.docx
@@ -4,65 +4,190 @@
   <w:body>
     <w:p>
       <w:pPr>
+        <w:jc w:val="center"/>
+      </w:pPr>
+      <w:r>
+        <w:rPr>
+          <w:b/>
+          <w:color w:val="E85C1A"/>
+          <w:sz w:val="56"/>
+        </w:rPr>
+        <w:t>{{ sop_title }}</w:t>
+      </w:r>
+    </w:p>
+    <w:p/>
+    <w:tbl>
+      <w:tblPr>
+        <w:tblStyle w:val="TableGrid"/>
+        <w:tblW w:type="auto" w:w="0"/>
+        <w:tblLook w:firstColumn="1" w:firstRow="1" w:lastColumn="0" w:lastRow="0" w:noHBand="0" w:noVBand="1" w:val="04A0"/>
+      </w:tblPr>
+      <w:tblGrid>
+        <w:gridCol w:w="4320"/>
+        <w:gridCol w:w="4320"/>
+      </w:tblGrid>
+      <w:tr>
+        <w:tc>
+          <w:tcPr>
+            <w:tcW w:type="dxa" w:w="4320"/>
+          </w:tcPr>
+          <w:p>
+            <w:r>
+              <w:rPr>
+                <w:b/>
+              </w:rPr>
+              <w:t>Client</w:t>
+            </w:r>
+          </w:p>
+        </w:tc>
+        <w:tc>
+          <w:tcPr>
+            <w:tcW w:type="dxa" w:w="4320"/>
+          </w:tcPr>
+          <w:p>
+            <w:r>
+              <w:t>{{ client_name }}</w:t>
+            </w:r>
+          </w:p>
+        </w:tc>
+      </w:tr>
+      <w:tr>
+        <w:tc>
+          <w:tcPr>
+            <w:tcW w:type="dxa" w:w="4320"/>
+          </w:tcPr>
+          <w:p>
+            <w:r>
+              <w:rPr>
+                <w:b/>
+              </w:rPr>
+              <w:t>Process</w:t>
+            </w:r>
+          </w:p>
+        </w:tc>
+        <w:tc>
+          <w:tcPr>
+            <w:tcW w:type="dxa" w:w="4320"/>
+          </w:tcPr>
+          <w:p>
+            <w:r>
+              <w:t>{{ process_name }}</w:t>
+            </w:r>
+          </w:p>
+        </w:tc>
+      </w:tr>
+      <w:tr>
+        <w:tc>
+          <w:tcPr>
+            <w:tcW w:type="dxa" w:w="4320"/>
+          </w:tcPr>
+          <w:p>
+            <w:r>
+              <w:rPr>
+                <w:b/>
+              </w:rPr>
+              <w:t>Meeting Date</w:t>
+            </w:r>
+          </w:p>
+        </w:tc>
+        <w:tc>
+          <w:tcPr>
+            <w:tcW w:type="dxa" w:w="4320"/>
+          </w:tcPr>
+          <w:p>
+            <w:r>
+              <w:t>{{ meeting_date }}</w:t>
+            </w:r>
+          </w:p>
+        </w:tc>
+      </w:tr>
+      <w:tr>
+        <w:tc>
+          <w:tcPr>
+            <w:tcW w:type="dxa" w:w="4320"/>
+          </w:tcPr>
+          <w:p>
+            <w:r>
+              <w:rPr>
+                <w:b/>
+              </w:rPr>
+              <w:t>Generated</w:t>
+            </w:r>
+          </w:p>
+        </w:tc>
+        <w:tc>
+          <w:tcPr>
+            <w:tcW w:type="dxa" w:w="4320"/>
+          </w:tcPr>
+          <w:p>
+            <w:r>
+              <w:t>{{ generated_date }}</w:t>
+            </w:r>
+          </w:p>
+        </w:tc>
+      </w:tr>
+      <w:tr>
+        <w:tc>
+          <w:tcPr>
+            <w:tcW w:type="dxa" w:w="4320"/>
+          </w:tcPr>
+          <w:p>
+            <w:r>
+              <w:rPr>
+                <w:b/>
+              </w:rPr>
+              <w:t>Total Steps</w:t>
+            </w:r>
+          </w:p>
+        </w:tc>
+        <w:tc>
+          <w:tcPr>
+            <w:tcW w:type="dxa" w:w="4320"/>
+          </w:tcPr>
+          <w:p>
+            <w:r>
+              <w:t>{{ step_count }}</w:t>
+            </w:r>
+          </w:p>
+        </w:tc>
+      </w:tr>
+    </w:tbl>
+    <w:p/>
+    <w:p>
+      <w:r>
+        <w:br w:type="page"/>
+      </w:r>
+    </w:p>
+    <w:p>
+      <w:pPr>
         <w:pStyle w:val="Heading1"/>
       </w:pPr>
       <w:r>
-        <w:t>{{ sop_title }}</w:t>
+        <w:rPr>
+          <w:color w:val="E85C1A"/>
+        </w:rPr>
+        <w:t>Table of Contents</w:t>
       </w:r>
     </w:p>
     <w:p>
       <w:r>
+        <w:t>{% for entry in toc_entries %}</w:t>
+      </w:r>
+    </w:p>
+    <w:p>
+      <w:pPr>
+        <w:spacing w:after="40" w:before="40"/>
+      </w:pPr>
+      <w:r>
         <w:rPr>
-          <w:b/>
+          <w:sz w:val="22"/>
         </w:rPr>
-        <w:t xml:space="preserve">Client: </w:t>
-      </w:r>
-      <w:r>
-        <w:t>{{ client_name }}</w:t>
+        <w:t>{{ '    ' if entry.indent else '' }}{{ entry.title }}</w:t>
       </w:r>
     </w:p>
     <w:p>
       <w:r>
-        <w:rPr>
-          <w:b/>
-        </w:rPr>
-        <w:t xml:space="preserve">Process: </w:t>
-      </w:r>
-      <w:r>
-        <w:t>{{ process_name }}</w:t>
-      </w:r>
-    </w:p>
-    <w:p>
-      <w:r>
-        <w:rPr>
-          <w:b/>
-        </w:rPr>
-        <w:t xml:space="preserve">Meeting Date: </w:t>
-      </w:r>
-      <w:r>
-        <w:t>{{ meeting_date }}</w:t>
-      </w:r>
-    </w:p>
-    <w:p>
-      <w:r>
-        <w:rPr>
-          <w:b/>
-        </w:rPr>
-        <w:t xml:space="preserve">Generated: </w:t>
-      </w:r>
-      <w:r>
-        <w:t>{{ generated_date }}</w:t>
-      </w:r>
-    </w:p>
-    <w:p>
-      <w:r>
-        <w:rPr>
-          <w:b/>
-        </w:rPr>
-        <w:t xml:space="preserve">Total Steps: </w:t>
-      </w:r>
-      <w:r>
-        <w:t>{{ step_count }}</w:t>
+        <w:t>{% endfor %}</w:t>
       </w:r>
     </w:p>
     <w:p>
@@ -71,29 +196,24 @@
       </w:r>
     </w:p>
     <w:p>
+      <w:r>
+        <w:t>{%- for section in sections_pre %}</w:t>
+      </w:r>
+    </w:p>
+    <w:p>
       <w:pPr>
         <w:pStyle w:val="Heading2"/>
       </w:pPr>
       <w:r>
-        <w:t>Sections</w:t>
-      </w:r>
-    </w:p>
-    <w:p>
-      <w:r>
-        <w:t>{%- for section in sections %}</w:t>
-      </w:r>
-    </w:p>
-    <w:p>
-      <w:pPr>
-        <w:pStyle w:val="Heading3"/>
-      </w:pPr>
-      <w:r>
+        <w:rPr>
+          <w:color w:val="E85C1A"/>
+        </w:rPr>
         <w:t>{{ section.section_title }}</w:t>
       </w:r>
     </w:p>
     <w:p>
       <w:r>
-        <w:t>{{ section.content_text | default("") }}</w:t>
+        <w:t>{{ section.content_text | default('') }}</w:t>
       </w:r>
     </w:p>
     <w:p>
@@ -108,9 +228,33 @@
     </w:p>
     <w:p>
       <w:pPr>
-        <w:pStyle w:val="Heading2"/>
+        <w:pStyle w:val="Heading1"/>
       </w:pPr>
       <w:r>
+        <w:rPr>
+          <w:color w:val="E85C1A"/>
+        </w:rPr>
+        <w:t>Process Map</w:t>
+      </w:r>
+    </w:p>
+    <w:p>
+      <w:r>
+        <w:t>{%- if process_map %}{{ process_map }}{%- else %}(Process map unavailable){%- endif %}</w:t>
+      </w:r>
+    </w:p>
+    <w:p>
+      <w:r>
+        <w:br w:type="page"/>
+      </w:r>
+    </w:p>
+    <w:p>
+      <w:pPr>
+        <w:pStyle w:val="Heading1"/>
+      </w:pPr>
+      <w:r>
+        <w:rPr>
+          <w:color w:val="E85C1A"/>
+        </w:rPr>
         <w:t>Detailed Procedure</w:t>
       </w:r>
     </w:p>
@@ -124,20 +268,32 @@
         <w:pStyle w:val="Heading3"/>
       </w:pPr>
       <w:r>
-        <w:t>{{ step.sequence }}. {{ step.title }}</w:t>
+        <w:rPr>
+          <w:color w:val="1A1A1A"/>
+        </w:rPr>
+        <w:t>Step {{ step.sequence }}: {{ step.title }}</w:t>
       </w:r>
     </w:p>
     <w:p>
       <w:r>
-        <w:t>{{ step.description | default("") }}</w:t>
+        <w:t>{{ step.description | default('') }}</w:t>
       </w:r>
     </w:p>
     <w:p>
       <w:r>
         <w:t>{%- for sub in step.sub_steps %}</w:t>
-        <w:br/>
-        <w:t>• {{ sub }}</w:t>
-        <w:br/>
+      </w:r>
+    </w:p>
+    <w:p>
+      <w:pPr>
+        <w:pStyle w:val="ListBullet"/>
+      </w:pPr>
+      <w:r>
+        <w:t>{{ sub }}</w:t>
+      </w:r>
+    </w:p>
+    <w:p>
+      <w:r>
         <w:t>{%- endfor %}</w:t>
       </w:r>
     </w:p>
@@ -148,9 +304,67 @@
     </w:p>
     <w:p>
       <w:r>
-        <w:t>{%- for callout in step.callouts %}{{ callout.callout_number }}. {{ callout.label }}</w:t>
-        <w:br/>
+        <w:t>{%- if step.callouts %}</w:t>
+      </w:r>
+    </w:p>
+    <w:p>
+      <w:r>
+        <w:rPr>
+          <w:b/>
+          <w:sz w:val="20"/>
+        </w:rPr>
+        <w:t>Callout References</w:t>
+      </w:r>
+    </w:p>
+    <w:p>
+      <w:r>
+        <w:t>{%- for callout in step.callouts %}</w:t>
+      </w:r>
+    </w:p>
+    <w:p>
+      <w:r>
+        <w:t>{{ callout.callout_number }}. {{ callout.label }}</w:t>
+      </w:r>
+    </w:p>
+    <w:p>
+      <w:r>
         <w:t>{%- endfor %}</w:t>
+      </w:r>
+    </w:p>
+    <w:p>
+      <w:r>
+        <w:t>{%- endif %}</w:t>
+      </w:r>
+    </w:p>
+    <w:p>
+      <w:r>
+        <w:t>{%- endfor %}</w:t>
+      </w:r>
+    </w:p>
+    <w:p>
+      <w:r>
+        <w:br w:type="page"/>
+      </w:r>
+    </w:p>
+    <w:p>
+      <w:r>
+        <w:t>{%- for section in sections_post %}</w:t>
+      </w:r>
+    </w:p>
+    <w:p>
+      <w:pPr>
+        <w:pStyle w:val="Heading2"/>
+      </w:pPr>
+      <w:r>
+        <w:rPr>
+          <w:color w:val="E85C1A"/>
+        </w:rPr>
+        <w:t>{{ section.section_title }}</w:t>
+      </w:r>
+    </w:p>
+    <w:p>
+      <w:r>
+        <w:t>{{ section.content_text | default('') }}</w:t>
       </w:r>
     </w:p>
     <w:p>

</xml_diff>

<commit_message>
feat: Phase 8 + 9 — annotation editor, role-based UI, UX polish
Phase 8: Konva.js annotation editor modal (drag callouts, delete, re-render),
PATCH /api/steps/{id}/callouts + POST render-annotated endpoints.

Phase 9: Role-gated tabs (History/Metrics editor+, Process Map viewer read-only),
clickable status dropdown in SOPPageHeader, like button, step delete with
sequence re-numbering, overview/history/matrices UI overhaul,
process map route + schema, StepCard/StepSidebar/TranscriptPanel UX polish.

Co-Authored-By: Claude Sonnet 4.6 <noreply@anthropic.com>
</commit_message>
<xml_diff>
--- a/sop-platform/data/templates/sop_template.docx
+++ b/sop-platform/data/templates/sop_template.docx
@@ -4,37 +4,83 @@
   <w:body>
     <w:p>
       <w:pPr>
-        <w:jc w:val="center"/>
+        <w:shd w:val="clear" w:color="auto" w:fill="E85C1A"/>
+        <w:spacing w:before="0" w:after="0"/>
       </w:pPr>
       <w:r>
         <w:rPr>
+          <w:rFonts w:ascii="Calibri" w:hAnsi="Calibri"/>
           <w:b/>
-          <w:color w:val="E85C1A"/>
-          <w:sz w:val="56"/>
+          <w:i w:val="0"/>
+          <w:color w:val="FFFFFF"/>
+          <w:sz w:val="26"/>
+        </w:rPr>
+        <w:t xml:space="preserve">  STANDARD OPERATING PROCEDURE</w:t>
+      </w:r>
+    </w:p>
+    <w:p>
+      <w:pPr>
+        <w:spacing w:before="480" w:after="120"/>
+      </w:pPr>
+      <w:r>
+        <w:rPr>
+          <w:rFonts w:ascii="Calibri" w:hAnsi="Calibri"/>
+          <w:b/>
+          <w:i w:val="0"/>
+          <w:color w:val="1A1A2E"/>
+          <w:sz w:val="44"/>
         </w:rPr>
         <w:t>{{ sop_title }}</w:t>
       </w:r>
     </w:p>
-    <w:p/>
+    <w:p>
+      <w:pPr>
+        <w:spacing w:before="0" w:after="360"/>
+      </w:pPr>
+      <w:r>
+        <w:rPr>
+          <w:rFonts w:ascii="Calibri" w:hAnsi="Calibri"/>
+          <w:b w:val="0"/>
+          <w:i/>
+          <w:color w:val="E85C1A"/>
+          <w:sz w:val="26"/>
+        </w:rPr>
+        <w:t>{{ process_name }}</w:t>
+      </w:r>
+    </w:p>
     <w:tbl>
       <w:tblPr>
         <w:tblStyle w:val="TableGrid"/>
         <w:tblW w:type="auto" w:w="0"/>
         <w:tblLook w:firstColumn="1" w:firstRow="1" w:lastColumn="0" w:lastRow="0" w:noHBand="0" w:noVBand="1" w:val="04A0"/>
+        <w:jc w:val="left"/>
+        <w:tblBorders>
+          <w:top w:val="single" w:sz="4" w:space="0" w:color="D1D5DB"/>
+          <w:left w:val="single" w:sz="4" w:space="0" w:color="D1D5DB"/>
+          <w:bottom w:val="single" w:sz="4" w:space="0" w:color="D1D5DB"/>
+          <w:right w:val="single" w:sz="4" w:space="0" w:color="D1D5DB"/>
+          <w:insideH w:val="single" w:sz="4" w:space="0" w:color="D1D5DB"/>
+          <w:insideV w:val="single" w:sz="4" w:space="0" w:color="D1D5DB"/>
+        </w:tblBorders>
       </w:tblPr>
       <w:tblGrid>
-        <w:gridCol w:w="4320"/>
-        <w:gridCol w:w="4320"/>
+        <w:gridCol w:w="4535"/>
+        <w:gridCol w:w="4535"/>
       </w:tblGrid>
       <w:tr>
         <w:tc>
           <w:tcPr>
-            <w:tcW w:type="dxa" w:w="4320"/>
+            <w:tcW w:type="dxa" w:w="2592"/>
+            <w:shd w:val="clear" w:color="auto" w:fill="F3F4F6"/>
           </w:tcPr>
           <w:p>
             <w:r>
               <w:rPr>
+                <w:rFonts w:ascii="Calibri" w:hAnsi="Calibri"/>
                 <w:b/>
+                <w:i w:val="0"/>
+                <w:color w:val="1A1A2E"/>
+                <w:sz w:val="20"/>
               </w:rPr>
               <w:t>Client</w:t>
             </w:r>
@@ -42,10 +88,17 @@
         </w:tc>
         <w:tc>
           <w:tcPr>
-            <w:tcW w:type="dxa" w:w="4320"/>
+            <w:tcW w:type="dxa" w:w="5040"/>
           </w:tcPr>
           <w:p>
             <w:r>
+              <w:rPr>
+                <w:rFonts w:ascii="Calibri" w:hAnsi="Calibri"/>
+                <w:b w:val="0"/>
+                <w:i w:val="0"/>
+                <w:color w:val="1A1A2E"/>
+                <w:sz w:val="20"/>
+              </w:rPr>
               <w:t>{{ client_name }}</w:t>
             </w:r>
           </w:p>
@@ -54,12 +107,17 @@
       <w:tr>
         <w:tc>
           <w:tcPr>
-            <w:tcW w:type="dxa" w:w="4320"/>
+            <w:tcW w:type="dxa" w:w="2592"/>
+            <w:shd w:val="clear" w:color="auto" w:fill="F3F4F6"/>
           </w:tcPr>
           <w:p>
             <w:r>
               <w:rPr>
+                <w:rFonts w:ascii="Calibri" w:hAnsi="Calibri"/>
                 <w:b/>
+                <w:i w:val="0"/>
+                <w:color w:val="1A1A2E"/>
+                <w:sz w:val="20"/>
               </w:rPr>
               <w:t>Process</w:t>
             </w:r>
@@ -67,10 +125,17 @@
         </w:tc>
         <w:tc>
           <w:tcPr>
-            <w:tcW w:type="dxa" w:w="4320"/>
+            <w:tcW w:type="dxa" w:w="5040"/>
           </w:tcPr>
           <w:p>
             <w:r>
+              <w:rPr>
+                <w:rFonts w:ascii="Calibri" w:hAnsi="Calibri"/>
+                <w:b w:val="0"/>
+                <w:i w:val="0"/>
+                <w:color w:val="1A1A2E"/>
+                <w:sz w:val="20"/>
+              </w:rPr>
               <w:t>{{ process_name }}</w:t>
             </w:r>
           </w:p>
@@ -79,12 +144,17 @@
       <w:tr>
         <w:tc>
           <w:tcPr>
-            <w:tcW w:type="dxa" w:w="4320"/>
+            <w:tcW w:type="dxa" w:w="2592"/>
+            <w:shd w:val="clear" w:color="auto" w:fill="F3F4F6"/>
           </w:tcPr>
           <w:p>
             <w:r>
               <w:rPr>
+                <w:rFonts w:ascii="Calibri" w:hAnsi="Calibri"/>
                 <w:b/>
+                <w:i w:val="0"/>
+                <w:color w:val="1A1A2E"/>
+                <w:sz w:val="20"/>
               </w:rPr>
               <w:t>Meeting Date</w:t>
             </w:r>
@@ -92,10 +162,17 @@
         </w:tc>
         <w:tc>
           <w:tcPr>
-            <w:tcW w:type="dxa" w:w="4320"/>
+            <w:tcW w:type="dxa" w:w="5040"/>
           </w:tcPr>
           <w:p>
             <w:r>
+              <w:rPr>
+                <w:rFonts w:ascii="Calibri" w:hAnsi="Calibri"/>
+                <w:b w:val="0"/>
+                <w:i w:val="0"/>
+                <w:color w:val="1A1A2E"/>
+                <w:sz w:val="20"/>
+              </w:rPr>
               <w:t>{{ meeting_date }}</w:t>
             </w:r>
           </w:p>
@@ -104,12 +181,17 @@
       <w:tr>
         <w:tc>
           <w:tcPr>
-            <w:tcW w:type="dxa" w:w="4320"/>
+            <w:tcW w:type="dxa" w:w="2592"/>
+            <w:shd w:val="clear" w:color="auto" w:fill="F3F4F6"/>
           </w:tcPr>
           <w:p>
             <w:r>
               <w:rPr>
+                <w:rFonts w:ascii="Calibri" w:hAnsi="Calibri"/>
                 <w:b/>
+                <w:i w:val="0"/>
+                <w:color w:val="1A1A2E"/>
+                <w:sz w:val="20"/>
               </w:rPr>
               <w:t>Generated</w:t>
             </w:r>
@@ -117,10 +199,17 @@
         </w:tc>
         <w:tc>
           <w:tcPr>
-            <w:tcW w:type="dxa" w:w="4320"/>
+            <w:tcW w:type="dxa" w:w="5040"/>
           </w:tcPr>
           <w:p>
             <w:r>
+              <w:rPr>
+                <w:rFonts w:ascii="Calibri" w:hAnsi="Calibri"/>
+                <w:b w:val="0"/>
+                <w:i w:val="0"/>
+                <w:color w:val="1A1A2E"/>
+                <w:sz w:val="20"/>
+              </w:rPr>
               <w:t>{{ generated_date }}</w:t>
             </w:r>
           </w:p>
@@ -129,12 +218,17 @@
       <w:tr>
         <w:tc>
           <w:tcPr>
-            <w:tcW w:type="dxa" w:w="4320"/>
+            <w:tcW w:type="dxa" w:w="2592"/>
+            <w:shd w:val="clear" w:color="auto" w:fill="F3F4F6"/>
           </w:tcPr>
           <w:p>
             <w:r>
               <w:rPr>
+                <w:rFonts w:ascii="Calibri" w:hAnsi="Calibri"/>
                 <w:b/>
+                <w:i w:val="0"/>
+                <w:color w:val="1A1A2E"/>
+                <w:sz w:val="20"/>
               </w:rPr>
               <w:t>Total Steps</w:t>
             </w:r>
@@ -142,17 +236,23 @@
         </w:tc>
         <w:tc>
           <w:tcPr>
-            <w:tcW w:type="dxa" w:w="4320"/>
+            <w:tcW w:type="dxa" w:w="5040"/>
           </w:tcPr>
           <w:p>
             <w:r>
+              <w:rPr>
+                <w:rFonts w:ascii="Calibri" w:hAnsi="Calibri"/>
+                <w:b w:val="0"/>
+                <w:i w:val="0"/>
+                <w:color w:val="1A1A2E"/>
+                <w:sz w:val="20"/>
+              </w:rPr>
               <w:t>{{ step_count }}</w:t>
             </w:r>
           </w:p>
         </w:tc>
       </w:tr>
     </w:tbl>
-    <w:p/>
     <w:p>
       <w:r>
         <w:br w:type="page"/>
@@ -161,33 +261,86 @@
     <w:p>
       <w:pPr>
         <w:pStyle w:val="Heading1"/>
+        <w:spacing w:before="0" w:after="240"/>
       </w:pPr>
       <w:r>
         <w:rPr>
+          <w:rFonts w:ascii="Calibri" w:hAnsi="Calibri"/>
+          <w:b/>
+          <w:i w:val="0"/>
           <w:color w:val="E85C1A"/>
+          <w:sz w:val="32"/>
         </w:rPr>
         <w:t>Table of Contents</w:t>
       </w:r>
     </w:p>
     <w:p>
+      <w:pPr>
+        <w:shd w:val="clear" w:color="auto" w:fill="E85C1A"/>
+        <w:spacing w:before="0" w:after="160"/>
+      </w:pPr>
       <w:r>
-        <w:t>{% for entry in toc_entries %}</w:t>
+        <w:rPr>
+          <w:rFonts w:ascii="Calibri" w:hAnsi="Calibri"/>
+          <w:b w:val="0"/>
+          <w:i w:val="0"/>
+          <w:sz w:val="8"/>
+        </w:rPr>
+        <w:t xml:space="preserve"> </w:t>
       </w:r>
     </w:p>
     <w:p>
       <w:pPr>
-        <w:spacing w:after="40" w:before="40"/>
+        <w:spacing w:after="0" w:before="0"/>
+      </w:pPr>
+      <w:r>
+        <w:t>{%- for entry in toc_entries %}</w:t>
+      </w:r>
+    </w:p>
+    <w:p>
+      <w:pPr>
+        <w:tabs>
+          <w:tab w:val="right" w:leader="dot" w:pos="7920"/>
+        </w:tabs>
+        <w:spacing w:before="40" w:after="40"/>
+        <w:ind w:left="{{ entry.left_twips }}" w:hanging="0"/>
       </w:pPr>
       <w:r>
         <w:rPr>
+          <w:rFonts w:ascii="Calibri" w:hAnsi="Calibri"/>
+          <w:b/>
+          <w:i w:val="0"/>
+          <w:color w:val="1A1A2E"/>
           <w:sz w:val="22"/>
         </w:rPr>
-        <w:t>{{ '    ' if entry.indent else '' }}{{ entry.title }}</w:t>
+        <w:t xml:space="preserve">{{ entry.num }}  </w:t>
+      </w:r>
+      <w:r>
+        <w:rPr>
+          <w:rFonts w:ascii="Calibri" w:hAnsi="Calibri"/>
+          <w:b/>
+          <w:i w:val="0"/>
+          <w:color w:val="1A1A2E"/>
+          <w:sz w:val="20"/>
+        </w:rPr>
+        <w:t>{{ entry.title }}</w:t>
+      </w:r>
+      <w:r>
+        <w:rPr>
+          <w:rFonts w:ascii="Calibri" w:hAnsi="Calibri"/>
+          <w:b w:val="0"/>
+          <w:i w:val="0"/>
+          <w:sz w:val="20"/>
+        </w:rPr>
+        <w:tab/>
       </w:r>
     </w:p>
     <w:p>
+      <w:pPr>
+        <w:spacing w:after="0"/>
+      </w:pPr>
       <w:r>
-        <w:t>{% endfor %}</w:t>
+        <w:t>{%- endfor %}</w:t>
       </w:r>
     </w:p>
     <w:p>
@@ -196,6 +349,9 @@
       </w:r>
     </w:p>
     <w:p>
+      <w:pPr>
+        <w:spacing w:after="0"/>
+      </w:pPr>
       <w:r>
         <w:t>{%- for section in sections_pre %}</w:t>
       </w:r>
@@ -203,20 +359,29 @@
     <w:p>
       <w:pPr>
         <w:pStyle w:val="Heading2"/>
+        <w:spacing w:before="360" w:after="120"/>
       </w:pPr>
       <w:r>
         <w:rPr>
+          <w:rFonts w:ascii="Calibri" w:hAnsi="Calibri"/>
+          <w:b/>
+          <w:i w:val="0"/>
           <w:color w:val="E85C1A"/>
+          <w:sz w:val="26"/>
         </w:rPr>
-        <w:t>{{ section.section_title }}</w:t>
+        <w:t>{{ section.num }}  {{ section.section_title }}</w:t>
       </w:r>
     </w:p>
     <w:p>
+      <w:pPr/>
       <w:r>
         <w:t>{{ section.content_text | default('') }}</w:t>
       </w:r>
     </w:p>
     <w:p>
+      <w:pPr>
+        <w:spacing w:after="0"/>
+      </w:pPr>
       <w:r>
         <w:t>{%- endfor %}</w:t>
       </w:r>
@@ -229,17 +394,23 @@
     <w:p>
       <w:pPr>
         <w:pStyle w:val="Heading1"/>
+        <w:spacing w:before="240" w:after="160"/>
       </w:pPr>
       <w:r>
         <w:rPr>
+          <w:rFonts w:ascii="Calibri" w:hAnsi="Calibri"/>
+          <w:b/>
+          <w:i w:val="0"/>
           <w:color w:val="E85C1A"/>
+          <w:sz w:val="30"/>
         </w:rPr>
-        <w:t>Process Map</w:t>
+        <w:t>{{ pm_section_num }}  Process Map</w:t>
       </w:r>
     </w:p>
     <w:p>
+      <w:pPr/>
       <w:r>
-        <w:t>{%- if process_map %}{{ process_map }}{%- else %}(Process map unavailable){%- endif %}</w:t>
+        <w:t>{%- if process_map %}{{ process_map }}{%- else %}(Process map not configured — use the Process Map tab to build one){%- endif %}</w:t>
       </w:r>
     </w:p>
     <w:p>
@@ -250,15 +421,23 @@
     <w:p>
       <w:pPr>
         <w:pStyle w:val="Heading1"/>
+        <w:spacing w:before="240" w:after="160"/>
       </w:pPr>
       <w:r>
         <w:rPr>
+          <w:rFonts w:ascii="Calibri" w:hAnsi="Calibri"/>
+          <w:b/>
+          <w:i w:val="0"/>
           <w:color w:val="E85C1A"/>
+          <w:sz w:val="30"/>
         </w:rPr>
-        <w:t>Detailed Procedure</w:t>
+        <w:t>{{ dp_section_num }}  Detailed Procedure</w:t>
       </w:r>
     </w:p>
     <w:p>
+      <w:pPr>
+        <w:spacing w:after="0"/>
+      </w:pPr>
       <w:r>
         <w:t>{%- for step in steps %}</w:t>
       </w:r>
@@ -266,20 +445,31 @@
     <w:p>
       <w:pPr>
         <w:pStyle w:val="Heading3"/>
+        <w:spacing w:before="320" w:after="80"/>
       </w:pPr>
       <w:r>
         <w:rPr>
-          <w:color w:val="1A1A1A"/>
+          <w:rFonts w:ascii="Calibri" w:hAnsi="Calibri"/>
+          <w:b/>
+          <w:i w:val="0"/>
+          <w:color w:val="1A1A2E"/>
+          <w:sz w:val="24"/>
         </w:rPr>
         <w:t>Step {{ step.sequence }}: {{ step.title }}</w:t>
       </w:r>
     </w:p>
     <w:p>
+      <w:pPr>
+        <w:spacing w:before="0" w:after="80"/>
+      </w:pPr>
       <w:r>
         <w:t>{{ step.description | default('') }}</w:t>
       </w:r>
     </w:p>
     <w:p>
+      <w:pPr>
+        <w:spacing w:after="0"/>
+      </w:pPr>
       <w:r>
         <w:t>{%- for sub in step.sub_steps %}</w:t>
       </w:r>
@@ -287,56 +477,103 @@
     <w:p>
       <w:pPr>
         <w:pStyle w:val="ListBullet"/>
+        <w:spacing w:before="0" w:after="40"/>
       </w:pPr>
       <w:r>
         <w:t>{{ sub }}</w:t>
       </w:r>
     </w:p>
     <w:p>
+      <w:pPr>
+        <w:spacing w:after="0"/>
+      </w:pPr>
       <w:r>
         <w:t>{%- endfor %}</w:t>
       </w:r>
     </w:p>
     <w:p>
+      <w:pPr>
+        <w:spacing w:before="80" w:after="80"/>
+      </w:pPr>
       <w:r>
         <w:t>{%- if step.screenshot %}{{ step.screenshot }}{%- endif %}</w:t>
       </w:r>
     </w:p>
     <w:p>
+      <w:pPr>
+        <w:spacing w:after="0"/>
+      </w:pPr>
       <w:r>
         <w:t>{%- if step.callouts %}</w:t>
       </w:r>
     </w:p>
     <w:p>
+      <w:pPr>
+        <w:spacing w:before="80" w:after="40"/>
+      </w:pPr>
       <w:r>
         <w:rPr>
+          <w:rFonts w:ascii="Calibri" w:hAnsi="Calibri"/>
           <w:b/>
+          <w:i/>
+          <w:color w:val="1A1A2E"/>
           <w:sz w:val="20"/>
         </w:rPr>
         <w:t>Callout References</w:t>
       </w:r>
     </w:p>
     <w:p>
+      <w:pPr>
+        <w:spacing w:after="0"/>
+      </w:pPr>
       <w:r>
         <w:t>{%- for callout in step.callouts %}</w:t>
       </w:r>
     </w:p>
     <w:p>
+      <w:pPr>
+        <w:pStyle w:val="ListNumber"/>
+        <w:spacing w:before="0" w:after="40"/>
+      </w:pPr>
       <w:r>
         <w:t>{{ callout.callout_number }}. {{ callout.label }}</w:t>
       </w:r>
     </w:p>
     <w:p>
+      <w:pPr>
+        <w:spacing w:after="0"/>
+      </w:pPr>
       <w:r>
         <w:t>{%- endfor %}</w:t>
       </w:r>
     </w:p>
     <w:p>
+      <w:pPr>
+        <w:spacing w:after="0"/>
+      </w:pPr>
       <w:r>
         <w:t>{%- endif %}</w:t>
       </w:r>
     </w:p>
     <w:p>
+      <w:pPr>
+        <w:shd w:val="clear" w:color="auto" w:fill="F3F4F6"/>
+        <w:spacing w:before="240" w:after="0"/>
+      </w:pPr>
+      <w:r>
+        <w:rPr>
+          <w:rFonts w:ascii="Calibri" w:hAnsi="Calibri"/>
+          <w:b w:val="0"/>
+          <w:i w:val="0"/>
+          <w:sz w:val="6"/>
+        </w:rPr>
+        <w:t xml:space="preserve"> </w:t>
+      </w:r>
+    </w:p>
+    <w:p>
+      <w:pPr>
+        <w:spacing w:after="0"/>
+      </w:pPr>
       <w:r>
         <w:t>{%- endfor %}</w:t>
       </w:r>
@@ -347,6 +584,9 @@
       </w:r>
     </w:p>
     <w:p>
+      <w:pPr>
+        <w:spacing w:after="0"/>
+      </w:pPr>
       <w:r>
         <w:t>{%- for section in sections_post %}</w:t>
       </w:r>
@@ -354,27 +594,36 @@
     <w:p>
       <w:pPr>
         <w:pStyle w:val="Heading2"/>
+        <w:spacing w:before="360" w:after="120"/>
       </w:pPr>
       <w:r>
         <w:rPr>
+          <w:rFonts w:ascii="Calibri" w:hAnsi="Calibri"/>
+          <w:b/>
+          <w:i w:val="0"/>
           <w:color w:val="E85C1A"/>
+          <w:sz w:val="26"/>
         </w:rPr>
-        <w:t>{{ section.section_title }}</w:t>
+        <w:t>{{ section.num }}  {{ section.section_title }}</w:t>
       </w:r>
     </w:p>
     <w:p>
+      <w:pPr/>
       <w:r>
         <w:t>{{ section.content_text | default('') }}</w:t>
       </w:r>
     </w:p>
     <w:p>
+      <w:pPr>
+        <w:spacing w:after="0"/>
+      </w:pPr>
       <w:r>
         <w:t>{%- endfor %}</w:t>
       </w:r>
     </w:p>
     <w:sectPr>
-      <w:pgSz w:w="12240" w:h="15840"/>
-      <w:pgMar w:top="1440" w:right="1800" w:bottom="1440" w:left="1800" w:header="720" w:footer="720" w:gutter="0"/>
+      <w:pgSz w:w="11906" w:h="16838"/>
+      <w:pgMar w:top="1417" w:right="1134" w:bottom="1417" w:left="1701" w:header="720" w:footer="720" w:gutter="0"/>
       <w:cols w:space="720"/>
       <w:docGrid w:linePitch="360"/>
     </w:sectPr>
@@ -745,6 +994,13 @@
     <w:name w:val="Normal"/>
     <w:qFormat/>
     <w:rsid w:val="00FC693F"/>
+    <w:pPr>
+      <w:spacing w:after="120"/>
+    </w:pPr>
+    <w:rPr>
+      <w:rFonts w:ascii="Calibri" w:hAnsi="Calibri"/>
+      <w:sz w:val="22"/>
+    </w:rPr>
   </w:style>
   <w:style w:type="paragraph" w:styleId="Header">
     <w:name w:val="header"/>

</xml_diff>

<commit_message>
feat: DOCX export polish + annotation render fixes
Updated doc_renderer, annotator, build_template for improved DOCX output;
bumped extractor requirements; API schema + route updates for export and steps.

Co-Authored-By: Claude Sonnet 4.6 <noreply@anthropic.com>
</commit_message>
<xml_diff>
--- a/sop-platform/data/templates/sop_template.docx
+++ b/sop-platform/data/templates/sop_template.docx
@@ -375,7 +375,7 @@
     <w:p>
       <w:pPr/>
       <w:r>
-        <w:t>{{ section.content_text | default('') }}</w:t>
+        <w:t>{{r section.content_text }}</w:t>
       </w:r>
     </w:p>
     <w:p>
@@ -610,7 +610,7 @@
     <w:p>
       <w:pPr/>
       <w:r>
-        <w:t>{{ section.content_text | default('') }}</w:t>
+        <w:t>{{r section.content_text }}</w:t>
       </w:r>
     </w:p>
     <w:p>

</xml_diff>